<commit_message>
Added the AVCDL threat candidate ranking template (SP 800-30) workbook / updated the Threat Prioritization Plan - Candidate Ranking Procedure tertiary document (additional SP 800-30 material)
</commit_message>
<xml_diff>
--- a/source/reference_documents/tertiary_documents/foundation/threat prioritization/candidate ranking/Threat Prioritization - Candidate Ranking.docx
+++ b/source/reference_documents/tertiary_documents/foundation/threat prioritization/candidate ranking/Threat Prioritization - Candidate Ranking.docx
@@ -40,7 +40,7 @@
         <w:t xml:space="preserve">Version </w:t>
       </w:r>
       <w:r>
-        <w:t>1</w:t>
+        <w:t>2</w:t>
       </w:r>
     </w:p>
     <w:p>
@@ -57,7 +57,7 @@
         <w:rPr>
           <w:noProof/>
         </w:rPr>
-        <w:t>7/28/26 10:22 AM</w:t>
+        <w:t>7/30/26 10:55 AM</w:t>
       </w:r>
       <w:r>
         <w:fldChar w:fldCharType="end"/>
@@ -220,19 +220,7 @@
     </w:p>
     <w:p>
       <w:r>
-        <w:t>This document is motivated by the need to have formal processes in place regarding the</w:t>
-      </w:r>
-      <w:r>
-        <w:t xml:space="preserve"> </w:t>
-      </w:r>
-      <w:r>
-        <w:t>disposition of cybersecurity-related threats in the context of the development of safety-critical,</w:t>
-      </w:r>
-      <w:r>
-        <w:t xml:space="preserve"> </w:t>
-      </w:r>
-      <w:r>
-        <w:t>cyber-physical systems</w:t>
+        <w:t>This document is motivated by the need to have formal processes in place regarding the disposition of cybersecurity-related threats in the context of the development of safety-critical, cyber-physical systems</w:t>
       </w:r>
       <w:r>
         <w:rPr>
@@ -930,13 +918,7 @@
         <w:t>security SME</w:t>
       </w:r>
       <w:r>
-        <w:t xml:space="preserve"> takes</w:t>
-      </w:r>
-      <w:r>
-        <w:t xml:space="preserve"> </w:t>
-      </w:r>
-      <w:r>
-        <w:t xml:space="preserve">the </w:t>
+        <w:t xml:space="preserve"> takes the </w:t>
       </w:r>
       <w:r>
         <w:rPr>
@@ -960,25 +942,13 @@
         <w:t xml:space="preserve"> threat candidates</w:t>
       </w:r>
       <w:r>
-        <w:t xml:space="preserve"> a</w:t>
-      </w:r>
-      <w:r>
-        <w:t>nd conducts a ranking on them</w:t>
-      </w:r>
-      <w:r>
-        <w:t xml:space="preserve"> to establish the likelihood</w:t>
+        <w:t xml:space="preserve"> and conducts a ranking on them to establish the likelihood</w:t>
       </w:r>
       <w:r>
         <w:t xml:space="preserve"> of each</w:t>
       </w:r>
       <w:r>
-        <w:t xml:space="preserve">. </w:t>
-      </w:r>
-      <w:r>
-        <w:t>This produces a</w:t>
-      </w:r>
-      <w:r>
-        <w:t xml:space="preserve"> list of </w:t>
+        <w:t xml:space="preserve">. This produces a list of </w:t>
       </w:r>
       <w:r>
         <w:rPr>
@@ -1041,13 +1011,7 @@
         <w:tab/>
       </w:r>
       <w:r>
-        <w:t>Some threat candidates may already have a likelihood provided</w:t>
-      </w:r>
-      <w:r>
-        <w:t>.</w:t>
-      </w:r>
-      <w:r>
-        <w:t xml:space="preserve"> This is usually the case there the threat candidate comes from an outside source, such as a researcher or cybersecurity monitoring of vulnerability reporting databases. In these cases, the provided likelihood (numeric or quantized) will need to be mapped into the organizations quantization.</w:t>
+        <w:t>Some threat candidates may already have a likelihood provided. This is usually the case there the threat candidate comes from an outside source, such as a researcher or cybersecurity monitoring of vulnerability reporting databases. In these cases, the provided likelihood (numeric or quantized) will need to be mapped into the organizations quantization.</w:t>
       </w:r>
     </w:p>
     <w:p>
@@ -1354,10 +1318,7 @@
               <w:spacing w:after="0" w:line="276" w:lineRule="auto"/>
             </w:pPr>
             <w:r>
-              <w:t>CCSS</w:t>
-            </w:r>
-            <w:r>
-              <w:t xml:space="preserve"> </w:t>
+              <w:t xml:space="preserve">CCSS </w:t>
             </w:r>
             <w:r>
               <w:rPr>
@@ -1425,10 +1386,7 @@
               <w:spacing w:after="0" w:line="276" w:lineRule="auto"/>
             </w:pPr>
             <w:r>
-              <w:t>CMSS</w:t>
-            </w:r>
-            <w:r>
-              <w:t xml:space="preserve"> </w:t>
+              <w:t xml:space="preserve">CMSS </w:t>
             </w:r>
             <w:r>
               <w:rPr>
@@ -1613,13 +1571,7 @@
     </w:p>
     <w:p>
       <w:r>
-        <w:t>The first three rubrics mentioned (CVSS, CCSS, and CMSS) produce a numeric score (value) which in the range [0,10]</w:t>
-      </w:r>
-      <w:r>
-        <w:t>.</w:t>
-      </w:r>
-      <w:r>
-        <w:t xml:space="preserve"> They also provide a quantization shown below. </w:t>
+        <w:t xml:space="preserve">The first three rubrics mentioned (CVSS, CCSS, and CMSS) produce a numeric score (value) which in the range [0,10]. They also provide a quantization shown below. </w:t>
       </w:r>
     </w:p>
     <w:p>
@@ -1904,10 +1856,7 @@
         <w:t>s</w:t>
       </w:r>
       <w:r>
-        <w:t xml:space="preserve"> provided for CVSS</w:t>
-      </w:r>
-      <w:r>
-        <w:t>.</w:t>
+        <w:t xml:space="preserve"> provided for CVSS.</w:t>
       </w:r>
     </w:p>
     <w:p>
@@ -1931,13 +1880,7 @@
         <w:tab/>
       </w:r>
       <w:r>
-        <w:t>A</w:t>
-      </w:r>
-      <w:r>
-        <w:t>s above, a</w:t>
-      </w:r>
-      <w:r>
-        <w:t xml:space="preserve"> true </w:t>
+        <w:t xml:space="preserve">As above, a true </w:t>
       </w:r>
       <w:r>
         <w:rPr>
@@ -1979,18 +1922,251 @@
       </w:pPr>
       <w:r>
         <w:lastRenderedPageBreak/>
+        <w:t xml:space="preserve">Likelihood </w:t>
+      </w:r>
+      <w:r>
+        <w:t>(SP 800-30 Rubric)</w:t>
+      </w:r>
+    </w:p>
+    <w:p>
+      <w:r>
+        <w:t>Unlike</w:t>
+      </w:r>
+      <w:r>
+        <w:t xml:space="preserve"> rubric</w:t>
+      </w:r>
+      <w:r>
+        <w:t>s that</w:t>
+      </w:r>
+      <w:r>
+        <w:t xml:space="preserve"> generates a numeric value, </w:t>
+      </w:r>
+      <w:r>
+        <w:t>the likelihood rubric provided by NIST SP 800-30 works directly with quantized values</w:t>
+      </w:r>
+      <w:r>
+        <w:t>.</w:t>
+      </w:r>
+      <w:r>
+        <w:t xml:space="preserve"> It provides semi-qualitative values that can be used to visualize the distribution of the quantization and also perform compositing in order to generate an overall likelihood of the threat candidate.</w:t>
+      </w:r>
+    </w:p>
+    <w:p>
+      <w:r>
+        <w:t>For comparison purposes, a visualization of SP 800-30 given the same treatment as with CVSS is</w:t>
+      </w:r>
+      <w:r>
+        <w:t xml:space="preserve"> shown below. </w:t>
+      </w:r>
+    </w:p>
+    <w:p>
+      <w:pPr>
+        <w:jc w:val="center"/>
+      </w:pPr>
+      <w:r>
+        <w:rPr>
+          <w:noProof/>
+        </w:rPr>
+        <w:drawing>
+          <wp:inline distT="0" distB="0" distL="0" distR="0" wp14:anchorId="16B71C9A" wp14:editId="42F0BA15">
+            <wp:extent cx="5934710" cy="880110"/>
+            <wp:effectExtent l="0" t="0" r="0" b="0"/>
+            <wp:docPr id="86716246" name="Picture 1"/>
+            <wp:cNvGraphicFramePr>
+              <a:graphicFrameLocks xmlns:a="http://schemas.openxmlformats.org/drawingml/2006/main" noChangeAspect="1"/>
+            </wp:cNvGraphicFramePr>
+            <a:graphic xmlns:a="http://schemas.openxmlformats.org/drawingml/2006/main">
+              <a:graphicData uri="http://schemas.openxmlformats.org/drawingml/2006/picture">
+                <pic:pic xmlns:pic="http://schemas.openxmlformats.org/drawingml/2006/picture">
+                  <pic:nvPicPr>
+                    <pic:cNvPr id="86716246" name="Picture 86716246"/>
+                    <pic:cNvPicPr/>
+                  </pic:nvPicPr>
+                  <pic:blipFill>
+                    <a:blip r:embed="rId10"/>
+                    <a:stretch>
+                      <a:fillRect/>
+                    </a:stretch>
+                  </pic:blipFill>
+                  <pic:spPr>
+                    <a:xfrm>
+                      <a:off x="0" y="0"/>
+                      <a:ext cx="5934710" cy="880110"/>
+                    </a:xfrm>
+                    <a:prstGeom prst="rect">
+                      <a:avLst/>
+                    </a:prstGeom>
+                  </pic:spPr>
+                </pic:pic>
+              </a:graphicData>
+            </a:graphic>
+          </wp:inline>
+        </w:drawing>
+      </w:r>
+    </w:p>
+    <w:p>
+      <w:r>
+        <w:t>One take away from this is that mapping from specific rubrics to domain quantizations does not guarantee correspondence across various likelihood rubrics</w:t>
+      </w:r>
+      <w:r>
+        <w:t>.</w:t>
+      </w:r>
+    </w:p>
+    <w:p>
+      <w:r>
+        <w:t xml:space="preserve">An interesting feature of SP 800-30 is that it </w:t>
+      </w:r>
+      <w:r>
+        <w:t>considers both adversarial and non-adversarial cases</w:t>
+      </w:r>
+      <w:r>
+        <w:t>.</w:t>
+      </w:r>
+      <w:r>
+        <w:t xml:space="preserve"> The first being the likelihood of threat event initiation. The second being the likelihood of threat event occurrence. It separately considers the likelihood that the threat results in an adverse impact.</w:t>
+      </w:r>
+    </w:p>
+    <w:p>
+      <w:r>
+        <w:t>The following table shows how SP 800-30 defines the various likelihood quantization bands for each of these</w:t>
+      </w:r>
+      <w:r>
+        <w:t xml:space="preserve">. </w:t>
+      </w:r>
+    </w:p>
+    <w:p>
+      <w:pPr>
+        <w:jc w:val="center"/>
+      </w:pPr>
+      <w:r>
+        <w:rPr>
+          <w:noProof/>
+        </w:rPr>
+        <w:drawing>
+          <wp:inline distT="0" distB="0" distL="0" distR="0" wp14:anchorId="6BDCC29C" wp14:editId="06291032">
+            <wp:extent cx="4572000" cy="1916170"/>
+            <wp:effectExtent l="0" t="0" r="0" b="1905"/>
+            <wp:docPr id="1186768944" name="Picture 2"/>
+            <wp:cNvGraphicFramePr>
+              <a:graphicFrameLocks xmlns:a="http://schemas.openxmlformats.org/drawingml/2006/main" noChangeAspect="1"/>
+            </wp:cNvGraphicFramePr>
+            <a:graphic xmlns:a="http://schemas.openxmlformats.org/drawingml/2006/main">
+              <a:graphicData uri="http://schemas.openxmlformats.org/drawingml/2006/picture">
+                <pic:pic xmlns:pic="http://schemas.openxmlformats.org/drawingml/2006/picture">
+                  <pic:nvPicPr>
+                    <pic:cNvPr id="1186768944" name="Picture 1186768944"/>
+                    <pic:cNvPicPr/>
+                  </pic:nvPicPr>
+                  <pic:blipFill>
+                    <a:blip r:embed="rId11"/>
+                    <a:stretch>
+                      <a:fillRect/>
+                    </a:stretch>
+                  </pic:blipFill>
+                  <pic:spPr>
+                    <a:xfrm>
+                      <a:off x="0" y="0"/>
+                      <a:ext cx="4650864" cy="1949222"/>
+                    </a:xfrm>
+                    <a:prstGeom prst="rect">
+                      <a:avLst/>
+                    </a:prstGeom>
+                  </pic:spPr>
+                </pic:pic>
+              </a:graphicData>
+            </a:graphic>
+          </wp:inline>
+        </w:drawing>
+      </w:r>
+    </w:p>
+    <w:p>
+      <w:pPr>
+        <w:spacing w:after="0"/>
+        <w:jc w:val="left"/>
+      </w:pPr>
+      <w:r>
+        <w:br w:type="page"/>
+      </w:r>
+    </w:p>
+    <w:p>
+      <w:r>
+        <w:lastRenderedPageBreak/>
+        <w:t>SP 800-30 then takes either the initiation or occurrence value (depending on the type) and impact value and composites them to generate an overall likelihood as shown below</w:t>
+      </w:r>
+      <w:r>
+        <w:t>.</w:t>
+      </w:r>
+    </w:p>
+    <w:p>
+      <w:pPr>
+        <w:jc w:val="center"/>
+      </w:pPr>
+      <w:r>
+        <w:rPr>
+          <w:noProof/>
+        </w:rPr>
+        <w:drawing>
+          <wp:inline distT="0" distB="0" distL="0" distR="0" wp14:anchorId="0C225417" wp14:editId="53398486">
+            <wp:extent cx="5323438" cy="2390022"/>
+            <wp:effectExtent l="0" t="0" r="0" b="0"/>
+            <wp:docPr id="544165117" name="Picture 3"/>
+            <wp:cNvGraphicFramePr>
+              <a:graphicFrameLocks xmlns:a="http://schemas.openxmlformats.org/drawingml/2006/main" noChangeAspect="1"/>
+            </wp:cNvGraphicFramePr>
+            <a:graphic xmlns:a="http://schemas.openxmlformats.org/drawingml/2006/main">
+              <a:graphicData uri="http://schemas.openxmlformats.org/drawingml/2006/picture">
+                <pic:pic xmlns:pic="http://schemas.openxmlformats.org/drawingml/2006/picture">
+                  <pic:nvPicPr>
+                    <pic:cNvPr id="544165117" name="Picture 544165117"/>
+                    <pic:cNvPicPr/>
+                  </pic:nvPicPr>
+                  <pic:blipFill>
+                    <a:blip r:embed="rId12"/>
+                    <a:stretch>
+                      <a:fillRect/>
+                    </a:stretch>
+                  </pic:blipFill>
+                  <pic:spPr>
+                    <a:xfrm>
+                      <a:off x="0" y="0"/>
+                      <a:ext cx="5368988" cy="2410472"/>
+                    </a:xfrm>
+                    <a:prstGeom prst="rect">
+                      <a:avLst/>
+                    </a:prstGeom>
+                  </pic:spPr>
+                </pic:pic>
+              </a:graphicData>
+            </a:graphic>
+          </wp:inline>
+        </w:drawing>
+      </w:r>
+    </w:p>
+    <w:p>
+      <w:pPr>
+        <w:spacing w:after="0"/>
+        <w:jc w:val="left"/>
+        <w:rPr>
+          <w:sz w:val="32"/>
+          <w:szCs w:val="32"/>
+        </w:rPr>
+      </w:pPr>
+      <w:r>
+        <w:br w:type="page"/>
+      </w:r>
+    </w:p>
+    <w:p>
+      <w:pPr>
+        <w:pStyle w:val="Heading2"/>
+      </w:pPr>
+      <w:r>
+        <w:lastRenderedPageBreak/>
         <w:t>Worst Case Scenario</w:t>
       </w:r>
     </w:p>
     <w:p>
       <w:r>
-        <w:t>Most product cybersecurity threat candidates are identified at a level far below that of the system level</w:t>
-      </w:r>
-      <w:r>
-        <w:t xml:space="preserve">. </w:t>
-      </w:r>
-      <w:r>
-        <w:t xml:space="preserve">Because of this, it is extremely helpful to provide a </w:t>
+        <w:t xml:space="preserve">Most product cybersecurity threat candidates are identified at a level far below that of the system level. Because of this, it is extremely helpful to provide a </w:t>
       </w:r>
       <w:r>
         <w:t xml:space="preserve">possible system-level </w:t>
@@ -2023,6 +2199,13 @@
       </w:r>
       <w:r>
         <w:t>Template</w:t>
+      </w:r>
+      <w:r>
+        <w:tab/>
+      </w:r>
+      <w:r>
+        <w:br/>
+        <w:t>(Numeric Rubric)</w:t>
       </w:r>
     </w:p>
     <w:p>
@@ -2367,7 +2550,7 @@
                     <pic:cNvPicPr/>
                   </pic:nvPicPr>
                   <pic:blipFill>
-                    <a:blip r:embed="rId10"/>
+                    <a:blip r:embed="rId13"/>
                     <a:stretch>
                       <a:fillRect/>
                     </a:stretch>
@@ -2587,7 +2770,7 @@
                     <pic:cNvPicPr/>
                   </pic:nvPicPr>
                   <pic:blipFill>
-                    <a:blip r:embed="rId11"/>
+                    <a:blip r:embed="rId14"/>
                     <a:stretch>
                       <a:fillRect/>
                     </a:stretch>
@@ -2823,7 +3006,7 @@
                     <pic:cNvPicPr/>
                   </pic:nvPicPr>
                   <pic:blipFill>
-                    <a:blip r:embed="rId12"/>
+                    <a:blip r:embed="rId15"/>
                     <a:stretch>
                       <a:fillRect/>
                     </a:stretch>
@@ -2971,7 +3154,7 @@
                     <pic:cNvPicPr/>
                   </pic:nvPicPr>
                   <pic:blipFill>
-                    <a:blip r:embed="rId13"/>
+                    <a:blip r:embed="rId16"/>
                     <a:stretch>
                       <a:fillRect/>
                     </a:stretch>
@@ -3202,10 +3385,7 @@
       <w:bookmarkStart w:id="13" w:name="_Rubric_Quantization"/>
       <w:bookmarkEnd w:id="13"/>
       <w:r>
-        <w:t xml:space="preserve">Rubric </w:t>
-      </w:r>
-      <w:r>
-        <w:t>Value</w:t>
+        <w:t>Rubric Value</w:t>
       </w:r>
     </w:p>
     <w:p>
@@ -3488,7 +3668,7 @@
                     <pic:cNvPicPr/>
                   </pic:nvPicPr>
                   <pic:blipFill>
-                    <a:blip r:embed="rId14"/>
+                    <a:blip r:embed="rId17"/>
                     <a:stretch>
                       <a:fillRect/>
                     </a:stretch>
@@ -3734,24 +3914,12 @@
       </w:pPr>
       <w:r>
         <w:lastRenderedPageBreak/>
-        <w:t>Domain</w:t>
-      </w:r>
-      <w:r>
-        <w:t xml:space="preserve"> Quantization</w:t>
-      </w:r>
-    </w:p>
-    <w:p>
-      <w:r>
-        <w:t xml:space="preserve">This sheet provides translation between the rubric value and </w:t>
-      </w:r>
-      <w:r>
-        <w:t>the target domain’s</w:t>
-      </w:r>
-      <w:r>
-        <w:t xml:space="preserve"> quantized representation</w:t>
-      </w:r>
-      <w:r>
-        <w:t>.</w:t>
+        <w:t>Domain Quantization</w:t>
+      </w:r>
+    </w:p>
+    <w:p>
+      <w:r>
+        <w:t>This sheet provides translation between the rubric value and the target domain’s quantized representation.</w:t>
       </w:r>
     </w:p>
     <w:p>
@@ -3768,14 +3936,7 @@
           <w:b/>
           <w:bCs/>
         </w:rPr>
-        <w:t>domain</w:t>
-      </w:r>
-      <w:r>
-        <w:rPr>
-          <w:b/>
-          <w:bCs/>
-        </w:rPr>
-        <w:t xml:space="preserve"> quantization</w:t>
+        <w:t>domain quantization</w:t>
       </w:r>
       <w:r>
         <w:t xml:space="preserve"> sheet of the workbook is shown below:</w:t>
@@ -3805,7 +3966,7 @@
                     <pic:cNvPicPr/>
                   </pic:nvPicPr>
                   <pic:blipFill>
-                    <a:blip r:embed="rId15"/>
+                    <a:blip r:embed="rId18"/>
                     <a:stretch>
                       <a:fillRect/>
                     </a:stretch>
@@ -3943,14 +4104,7 @@
           <w:b/>
           <w:bCs/>
         </w:rPr>
-        <w:t>domain</w:t>
-      </w:r>
-      <w:r>
-        <w:rPr>
-          <w:b/>
-          <w:bCs/>
-        </w:rPr>
-        <w:t xml:space="preserve"> quantization</w:t>
+        <w:t>domain quantization</w:t>
       </w:r>
       <w:r>
         <w:t xml:space="preserve"> field on the </w:t>
@@ -4060,6 +4214,1257 @@
       </w:r>
       <w:r>
         <w:t>.</w:t>
+      </w:r>
+    </w:p>
+    <w:p>
+      <w:pPr>
+        <w:spacing w:after="0"/>
+        <w:jc w:val="left"/>
+        <w:rPr>
+          <w:sz w:val="40"/>
+          <w:szCs w:val="40"/>
+        </w:rPr>
+      </w:pPr>
+      <w:r>
+        <w:br w:type="page"/>
+      </w:r>
+    </w:p>
+    <w:p>
+      <w:pPr>
+        <w:pStyle w:val="Heading1"/>
+      </w:pPr>
+      <w:r>
+        <w:lastRenderedPageBreak/>
+        <w:t xml:space="preserve">Threat Candidate Ranking </w:t>
+      </w:r>
+      <w:r>
+        <w:t>Template</w:t>
+      </w:r>
+      <w:r>
+        <w:tab/>
+      </w:r>
+      <w:r>
+        <w:br/>
+        <w:t>(</w:t>
+      </w:r>
+      <w:r>
+        <w:t>NIST SP 800-30 Rubric</w:t>
+      </w:r>
+      <w:r>
+        <w:t>)</w:t>
+      </w:r>
+    </w:p>
+    <w:p>
+      <w:pPr>
+        <w:pStyle w:val="FirstParagraph"/>
+      </w:pPr>
+      <w:r>
+        <w:t xml:space="preserve">The </w:t>
+      </w:r>
+      <w:r>
+        <w:t xml:space="preserve">threat candidate ranking </w:t>
+      </w:r>
+      <w:r>
+        <w:t xml:space="preserve">may be documented using the </w:t>
+      </w:r>
+      <w:r>
+        <w:rPr>
+          <w:b/>
+          <w:bCs/>
+        </w:rPr>
+        <w:t xml:space="preserve">AVCDL </w:t>
+      </w:r>
+      <w:r>
+        <w:rPr>
+          <w:b/>
+          <w:bCs/>
+        </w:rPr>
+        <w:t xml:space="preserve">threat candidate ranking </w:t>
+      </w:r>
+      <w:r>
+        <w:rPr>
+          <w:b/>
+          <w:bCs/>
+        </w:rPr>
+        <w:t>(SP 800-30)</w:t>
+      </w:r>
+      <w:r>
+        <w:rPr>
+          <w:b/>
+          <w:bCs/>
+        </w:rPr>
+        <w:t xml:space="preserve"> </w:t>
+      </w:r>
+      <w:r>
+        <w:rPr>
+          <w:b/>
+          <w:bCs/>
+        </w:rPr>
+        <w:t xml:space="preserve">template </w:t>
+      </w:r>
+      <w:r>
+        <w:t>Microsoft Excel workbook</w:t>
+      </w:r>
+      <w:r>
+        <w:rPr>
+          <w:b/>
+          <w:bCs/>
+          <w:color w:val="0070C0"/>
+        </w:rPr>
+        <w:t xml:space="preserve"> </w:t>
+      </w:r>
+      <w:r>
+        <w:rPr>
+          <w:b/>
+          <w:bCs/>
+          <w:color w:val="0070C0"/>
+          <w:vertAlign w:val="superscript"/>
+        </w:rPr>
+        <w:t>[</w:t>
+      </w:r>
+      <w:r>
+        <w:rPr>
+          <w:b/>
+          <w:bCs/>
+          <w:color w:val="0070C0"/>
+          <w:vertAlign w:val="superscript"/>
+        </w:rPr>
+        <w:t>10</w:t>
+      </w:r>
+      <w:r>
+        <w:rPr>
+          <w:b/>
+          <w:bCs/>
+          <w:color w:val="0070C0"/>
+          <w:vertAlign w:val="superscript"/>
+        </w:rPr>
+        <w:t>]</w:t>
+      </w:r>
+      <w:r>
+        <w:t xml:space="preserve"> when the NIST SP 800-30 rubric is used.</w:t>
+      </w:r>
+    </w:p>
+    <w:p>
+      <w:pPr>
+        <w:pStyle w:val="Note"/>
+      </w:pPr>
+      <w:r>
+        <w:rPr>
+          <w:b/>
+          <w:bCs/>
+          <w:color w:val="0070C0"/>
+        </w:rPr>
+        <w:t>Note:</w:t>
+      </w:r>
+      <w:r>
+        <w:tab/>
+        <w:t xml:space="preserve">Other </w:t>
+      </w:r>
+      <w:r>
+        <w:t>forms</w:t>
+      </w:r>
+      <w:r>
+        <w:t xml:space="preserve"> of documentation are permissible so long as they provide the information laid out in this document.</w:t>
+      </w:r>
+    </w:p>
+    <w:p>
+      <w:pPr>
+        <w:pStyle w:val="FirstParagraph"/>
+      </w:pPr>
+      <w:r>
+        <w:t>There workbook</w:t>
+      </w:r>
+      <w:r>
+        <w:t xml:space="preserve"> contains the following sheets</w:t>
+      </w:r>
+      <w:r>
+        <w:t>:</w:t>
+      </w:r>
+    </w:p>
+    <w:p>
+      <w:pPr>
+        <w:pStyle w:val="ListParagraph"/>
+      </w:pPr>
+      <w:r>
+        <w:t>Cover sheet</w:t>
+      </w:r>
+    </w:p>
+    <w:p>
+      <w:pPr>
+        <w:pStyle w:val="ListParagraph"/>
+      </w:pPr>
+      <w:r>
+        <w:t>Revision history</w:t>
+      </w:r>
+    </w:p>
+    <w:p>
+      <w:pPr>
+        <w:pStyle w:val="ListParagraph"/>
+      </w:pPr>
+      <w:r>
+        <w:t>Reference documents</w:t>
+      </w:r>
+    </w:p>
+    <w:p>
+      <w:pPr>
+        <w:pStyle w:val="ListParagraph"/>
+      </w:pPr>
+      <w:hyperlink w:anchor="_Ranking_(SP_800-30)" w:history="1">
+        <w:r>
+          <w:rPr>
+            <w:rStyle w:val="Hyperlink"/>
+          </w:rPr>
+          <w:t>Ranking</w:t>
+        </w:r>
+      </w:hyperlink>
+    </w:p>
+    <w:p>
+      <w:pPr>
+        <w:pStyle w:val="ListParagraph"/>
+      </w:pPr>
+      <w:hyperlink w:anchor="_800-30_Quantization" w:history="1">
+        <w:r>
+          <w:rPr>
+            <w:rStyle w:val="Hyperlink"/>
+          </w:rPr>
+          <w:t>800-30</w:t>
+        </w:r>
+        <w:r>
+          <w:rPr>
+            <w:rStyle w:val="Hyperlink"/>
+          </w:rPr>
+          <w:t xml:space="preserve"> quantization</w:t>
+        </w:r>
+      </w:hyperlink>
+    </w:p>
+    <w:p>
+      <w:pPr>
+        <w:pStyle w:val="ListParagraph"/>
+      </w:pPr>
+      <w:r>
+        <w:t>Legend</w:t>
+      </w:r>
+    </w:p>
+    <w:p>
+      <w:pPr>
+        <w:pStyle w:val="BodyText"/>
+      </w:pPr>
+      <w:r>
+        <w:t xml:space="preserve">Because this template is a variant of the previously discussed one, only the </w:t>
+      </w:r>
+      <w:r>
+        <w:rPr>
+          <w:b/>
+          <w:bCs/>
+        </w:rPr>
+        <w:t>ranking</w:t>
+      </w:r>
+      <w:r>
+        <w:t xml:space="preserve"> and </w:t>
+      </w:r>
+      <w:r>
+        <w:rPr>
+          <w:b/>
+          <w:bCs/>
+        </w:rPr>
+        <w:t>quantization</w:t>
+      </w:r>
+      <w:r>
+        <w:t xml:space="preserve"> sheets will be covered</w:t>
+      </w:r>
+      <w:r>
+        <w:t>.</w:t>
+      </w:r>
+    </w:p>
+    <w:p>
+      <w:pPr>
+        <w:pStyle w:val="Heading2"/>
+      </w:pPr>
+      <w:r>
+        <w:t>Duplication of Rows in the Various Sheets</w:t>
+      </w:r>
+    </w:p>
+    <w:p>
+      <w:pPr>
+        <w:pStyle w:val="BodyText"/>
+      </w:pPr>
+      <w:r>
+        <w:t xml:space="preserve">When there is the need to add rows to the various sheets of the workbook, be sure to duplicate an existing row. This is because validation checks </w:t>
+      </w:r>
+      <w:r>
+        <w:t>and inter-sheet lookups may be</w:t>
+      </w:r>
+      <w:r>
+        <w:t xml:space="preserve"> attached to some of the cells which enables the use of dropdown lists</w:t>
+      </w:r>
+      <w:r>
+        <w:t xml:space="preserve"> and auto-population</w:t>
+      </w:r>
+      <w:r>
+        <w:t>.</w:t>
+      </w:r>
+    </w:p>
+    <w:p>
+      <w:pPr>
+        <w:spacing w:after="0"/>
+        <w:jc w:val="left"/>
+        <w:rPr>
+          <w:sz w:val="32"/>
+          <w:szCs w:val="32"/>
+        </w:rPr>
+      </w:pPr>
+      <w:r>
+        <w:br w:type="page"/>
+      </w:r>
+    </w:p>
+    <w:p>
+      <w:pPr>
+        <w:pStyle w:val="Heading2"/>
+        <w:rPr>
+          <w:sz w:val="22"/>
+          <w:szCs w:val="22"/>
+        </w:rPr>
+      </w:pPr>
+      <w:bookmarkStart w:id="18" w:name="_Ranking_(SP_800-30)"/>
+      <w:bookmarkEnd w:id="18"/>
+      <w:r>
+        <w:lastRenderedPageBreak/>
+        <w:t>Ranking</w:t>
+      </w:r>
+      <w:r>
+        <w:t xml:space="preserve"> (</w:t>
+      </w:r>
+      <w:r>
+        <w:t>SP 800-30)</w:t>
+      </w:r>
+    </w:p>
+    <w:p>
+      <w:r>
+        <w:t xml:space="preserve">The </w:t>
+      </w:r>
+      <w:r>
+        <w:rPr>
+          <w:b/>
+          <w:bCs/>
+        </w:rPr>
+        <w:t>ranking</w:t>
+      </w:r>
+      <w:r>
+        <w:t xml:space="preserve"> sheet of the workbook is shown below:</w:t>
+      </w:r>
+    </w:p>
+    <w:p>
+      <w:pPr>
+        <w:jc w:val="center"/>
+      </w:pPr>
+      <w:r>
+        <w:rPr>
+          <w:noProof/>
+        </w:rPr>
+        <w:drawing>
+          <wp:inline distT="0" distB="0" distL="0" distR="0" wp14:anchorId="3DCC0B8A" wp14:editId="38D2BB14">
+            <wp:extent cx="5998119" cy="1584085"/>
+            <wp:effectExtent l="0" t="0" r="0" b="3810"/>
+            <wp:docPr id="1884534984" name="Picture 1"/>
+            <wp:cNvGraphicFramePr>
+              <a:graphicFrameLocks xmlns:a="http://schemas.openxmlformats.org/drawingml/2006/main" noChangeAspect="1"/>
+            </wp:cNvGraphicFramePr>
+            <a:graphic xmlns:a="http://schemas.openxmlformats.org/drawingml/2006/main">
+              <a:graphicData uri="http://schemas.openxmlformats.org/drawingml/2006/picture">
+                <pic:pic xmlns:pic="http://schemas.openxmlformats.org/drawingml/2006/picture">
+                  <pic:nvPicPr>
+                    <pic:cNvPr id="1884534984" name="Picture 1"/>
+                    <pic:cNvPicPr/>
+                  </pic:nvPicPr>
+                  <pic:blipFill>
+                    <a:blip r:embed="rId19"/>
+                    <a:stretch>
+                      <a:fillRect/>
+                    </a:stretch>
+                  </pic:blipFill>
+                  <pic:spPr>
+                    <a:xfrm>
+                      <a:off x="0" y="0"/>
+                      <a:ext cx="5998119" cy="1584085"/>
+                    </a:xfrm>
+                    <a:prstGeom prst="rect">
+                      <a:avLst/>
+                    </a:prstGeom>
+                  </pic:spPr>
+                </pic:pic>
+              </a:graphicData>
+            </a:graphic>
+          </wp:inline>
+        </w:drawing>
+      </w:r>
+    </w:p>
+    <w:p>
+      <w:pPr>
+        <w:pStyle w:val="Heading3"/>
+      </w:pPr>
+      <w:r>
+        <w:t xml:space="preserve">Candidate </w:t>
+      </w:r>
+      <w:r>
+        <w:t>ID</w:t>
+      </w:r>
+    </w:p>
+    <w:p>
+      <w:r>
+        <w:t xml:space="preserve">This is the unique ID of the </w:t>
+      </w:r>
+      <w:r>
+        <w:t>threat candidate</w:t>
+      </w:r>
+      <w:r>
+        <w:t>.</w:t>
+      </w:r>
+    </w:p>
+    <w:p>
+      <w:pPr>
+        <w:ind w:left="720" w:hanging="720"/>
+      </w:pPr>
+      <w:r>
+        <w:rPr>
+          <w:b/>
+          <w:bCs/>
+          <w:color w:val="0070C0"/>
+        </w:rPr>
+        <w:t>Note:</w:t>
+      </w:r>
+      <w:r>
+        <w:tab/>
+      </w:r>
+      <w:r>
+        <w:t>This value should be copied from the triage output providing input to this activity.</w:t>
+      </w:r>
+    </w:p>
+    <w:p>
+      <w:pPr>
+        <w:pStyle w:val="Heading3"/>
+      </w:pPr>
+      <w:r>
+        <w:t>Description</w:t>
+      </w:r>
+    </w:p>
+    <w:p>
+      <w:r>
+        <w:t xml:space="preserve">This </w:t>
+      </w:r>
+      <w:r>
+        <w:t>a description of the threat candidate.</w:t>
+      </w:r>
+    </w:p>
+    <w:p>
+      <w:pPr>
+        <w:ind w:left="720" w:hanging="720"/>
+      </w:pPr>
+      <w:r>
+        <w:rPr>
+          <w:b/>
+          <w:bCs/>
+          <w:color w:val="0070C0"/>
+        </w:rPr>
+        <w:t>Note:</w:t>
+      </w:r>
+      <w:r>
+        <w:tab/>
+      </w:r>
+      <w:r>
+        <w:t>This value should be copied from the triage output providing input to this activity.</w:t>
+      </w:r>
+    </w:p>
+    <w:p>
+      <w:pPr>
+        <w:pStyle w:val="Heading3"/>
+      </w:pPr>
+      <w:r>
+        <w:t>Element</w:t>
+      </w:r>
+    </w:p>
+    <w:p>
+      <w:r>
+        <w:t xml:space="preserve">This is the </w:t>
+      </w:r>
+      <w:r>
+        <w:t>name of the element within the system where the threat candidate originates.</w:t>
+      </w:r>
+    </w:p>
+    <w:p>
+      <w:pPr>
+        <w:ind w:left="720" w:hanging="720"/>
+      </w:pPr>
+      <w:r>
+        <w:rPr>
+          <w:b/>
+          <w:bCs/>
+          <w:color w:val="0070C0"/>
+        </w:rPr>
+        <w:t>Note:</w:t>
+      </w:r>
+      <w:r>
+        <w:tab/>
+      </w:r>
+      <w:r>
+        <w:t>This field is provided to give context to the threat candidate.</w:t>
+      </w:r>
+    </w:p>
+    <w:p>
+      <w:pPr>
+        <w:pStyle w:val="Heading3"/>
+      </w:pPr>
+      <w:r>
+        <w:t>Worst Case</w:t>
+      </w:r>
+    </w:p>
+    <w:p>
+      <w:r>
+        <w:t xml:space="preserve">This is </w:t>
+      </w:r>
+      <w:r>
+        <w:t>a</w:t>
+      </w:r>
+      <w:r>
+        <w:t xml:space="preserve"> </w:t>
+      </w:r>
+      <w:r>
+        <w:t>worst case scenario assuming the threat is realized.</w:t>
+      </w:r>
+    </w:p>
+    <w:p>
+      <w:pPr>
+        <w:pStyle w:val="Heading3"/>
+      </w:pPr>
+      <w:r>
+        <w:t>Rubric Metadata</w:t>
+      </w:r>
+    </w:p>
+    <w:p>
+      <w:r>
+        <w:t xml:space="preserve">This is </w:t>
+      </w:r>
+      <w:r>
+        <w:t>a text representation of the inputs (parametrics) needed to replicate the rubric’s output value generation.</w:t>
+      </w:r>
+    </w:p>
+    <w:p>
+      <w:pPr>
+        <w:ind w:left="720" w:hanging="720"/>
+      </w:pPr>
+      <w:r>
+        <w:rPr>
+          <w:b/>
+          <w:bCs/>
+          <w:color w:val="0070C0"/>
+        </w:rPr>
+        <w:t>Note:</w:t>
+      </w:r>
+      <w:r>
+        <w:tab/>
+      </w:r>
+      <w:r>
+        <w:t xml:space="preserve">This field is </w:t>
+      </w:r>
+      <w:r>
+        <w:t xml:space="preserve">included for consistency and is pre-populated with </w:t>
+      </w:r>
+      <w:r>
+        <w:rPr>
+          <w:b/>
+          <w:bCs/>
+          <w:color w:val="EE0000"/>
+        </w:rPr>
+        <w:t>N/A</w:t>
+      </w:r>
+      <w:r>
+        <w:t>.</w:t>
+      </w:r>
+    </w:p>
+    <w:p>
+      <w:pPr>
+        <w:spacing w:after="0"/>
+        <w:jc w:val="left"/>
+        <w:rPr>
+          <w:color w:val="002060"/>
+          <w:sz w:val="28"/>
+          <w:szCs w:val="28"/>
+        </w:rPr>
+      </w:pPr>
+      <w:r>
+        <w:br w:type="page"/>
+      </w:r>
+    </w:p>
+    <w:p>
+      <w:pPr>
+        <w:pStyle w:val="Heading3"/>
+      </w:pPr>
+      <w:r>
+        <w:lastRenderedPageBreak/>
+        <w:t>Initiation / Occurrence</w:t>
+      </w:r>
+    </w:p>
+    <w:p>
+      <w:r>
+        <w:t xml:space="preserve">This is the quantization of the likelihood </w:t>
+      </w:r>
+      <w:r>
+        <w:t>of either the initiation (adversarial) or occurrence (non-adversarial) of the threat candidate</w:t>
+      </w:r>
+      <w:r>
+        <w:t>.</w:t>
+      </w:r>
+    </w:p>
+    <w:p>
+      <w:pPr>
+        <w:ind w:left="720" w:hanging="720"/>
+      </w:pPr>
+      <w:r>
+        <w:rPr>
+          <w:b/>
+          <w:bCs/>
+          <w:color w:val="0070C0"/>
+        </w:rPr>
+        <w:t>Note:</w:t>
+      </w:r>
+      <w:r>
+        <w:tab/>
+      </w:r>
+      <w:r>
+        <w:t xml:space="preserve">This field is auto-populated based on information in the </w:t>
+      </w:r>
+      <w:r>
+        <w:rPr>
+          <w:b/>
+          <w:bCs/>
+        </w:rPr>
+        <w:t>800-30</w:t>
+      </w:r>
+      <w:r>
+        <w:rPr>
+          <w:b/>
+          <w:bCs/>
+        </w:rPr>
+        <w:t xml:space="preserve"> quantization</w:t>
+      </w:r>
+      <w:r>
+        <w:t xml:space="preserve"> sheet.</w:t>
+      </w:r>
+      <w:r>
+        <w:t xml:space="preserve"> Values are based on information from NIST SP 800-30.</w:t>
+      </w:r>
+      <w:r>
+        <w:tab/>
+      </w:r>
+      <w:r>
+        <w:br/>
+      </w:r>
+      <w:r>
+        <w:br/>
+        <w:t>This field should not be altered manually.</w:t>
+      </w:r>
+    </w:p>
+    <w:p>
+      <w:pPr>
+        <w:pStyle w:val="Heading3"/>
+      </w:pPr>
+      <w:r>
+        <w:t>Adverse Impact</w:t>
+      </w:r>
+    </w:p>
+    <w:p>
+      <w:r>
+        <w:t xml:space="preserve">This is the quantization of the likelihood </w:t>
+      </w:r>
+      <w:r>
+        <w:t>that the threat candidate has an adverse impact should it be realized</w:t>
+      </w:r>
+      <w:r>
+        <w:t>.</w:t>
+      </w:r>
+    </w:p>
+    <w:p>
+      <w:pPr>
+        <w:ind w:left="720" w:hanging="720"/>
+      </w:pPr>
+      <w:r>
+        <w:rPr>
+          <w:b/>
+          <w:bCs/>
+          <w:color w:val="0070C0"/>
+        </w:rPr>
+        <w:t>Note:</w:t>
+      </w:r>
+      <w:r>
+        <w:tab/>
+      </w:r>
+      <w:r>
+        <w:t xml:space="preserve">This field is auto-populated based on information in the </w:t>
+      </w:r>
+      <w:r>
+        <w:rPr>
+          <w:b/>
+          <w:bCs/>
+        </w:rPr>
+        <w:t>800-30</w:t>
+      </w:r>
+      <w:r>
+        <w:rPr>
+          <w:b/>
+          <w:bCs/>
+        </w:rPr>
+        <w:t xml:space="preserve"> quantization</w:t>
+      </w:r>
+      <w:r>
+        <w:t xml:space="preserve"> sheet. Values are based on information from NIST SP 800-30.</w:t>
+      </w:r>
+      <w:r>
+        <w:tab/>
+      </w:r>
+      <w:r>
+        <w:br/>
+      </w:r>
+      <w:r>
+        <w:br/>
+        <w:t>This field should not be altered manually.</w:t>
+      </w:r>
+    </w:p>
+    <w:p>
+      <w:pPr>
+        <w:pStyle w:val="Heading3"/>
+      </w:pPr>
+      <w:r>
+        <w:t>Overall</w:t>
+      </w:r>
+      <w:r>
+        <w:t xml:space="preserve"> Likelihood</w:t>
+      </w:r>
+    </w:p>
+    <w:p>
+      <w:r>
+        <w:t xml:space="preserve">This </w:t>
+      </w:r>
+      <w:r>
+        <w:t xml:space="preserve">is the quantization of the </w:t>
+      </w:r>
+      <w:r>
+        <w:t xml:space="preserve">overall </w:t>
+      </w:r>
+      <w:r>
+        <w:t xml:space="preserve">likelihood </w:t>
+      </w:r>
+      <w:r>
+        <w:t xml:space="preserve">as determined by compositing the </w:t>
+      </w:r>
+      <w:r>
+        <w:rPr>
+          <w:b/>
+          <w:bCs/>
+        </w:rPr>
+        <w:t>initiation / occurrence</w:t>
+      </w:r>
+      <w:r>
+        <w:t xml:space="preserve"> and </w:t>
+      </w:r>
+      <w:r>
+        <w:rPr>
+          <w:b/>
+          <w:bCs/>
+        </w:rPr>
+        <w:t>adverse impact</w:t>
+      </w:r>
+      <w:r>
+        <w:t xml:space="preserve"> </w:t>
+      </w:r>
+      <w:r>
+        <w:t>values</w:t>
+      </w:r>
+      <w:r>
+        <w:t>.</w:t>
+      </w:r>
+    </w:p>
+    <w:p>
+      <w:pPr>
+        <w:ind w:left="720" w:hanging="720"/>
+      </w:pPr>
+      <w:r>
+        <w:rPr>
+          <w:b/>
+          <w:bCs/>
+          <w:color w:val="0070C0"/>
+        </w:rPr>
+        <w:t>Note:</w:t>
+      </w:r>
+      <w:r>
+        <w:tab/>
+      </w:r>
+      <w:r>
+        <w:t xml:space="preserve">This field is </w:t>
+      </w:r>
+      <w:r>
+        <w:t xml:space="preserve">calculated based on the </w:t>
+      </w:r>
+      <w:r>
+        <w:rPr>
+          <w:b/>
+          <w:bCs/>
+        </w:rPr>
+        <w:t>initiation / occurrence</w:t>
+      </w:r>
+      <w:r>
+        <w:t xml:space="preserve"> and </w:t>
+      </w:r>
+      <w:r>
+        <w:rPr>
+          <w:b/>
+          <w:bCs/>
+        </w:rPr>
+        <w:t>adverse impact</w:t>
+      </w:r>
+      <w:r>
+        <w:t xml:space="preserve"> fields based on information specified in NIST SP 800-30</w:t>
+      </w:r>
+      <w:r>
+        <w:t>.</w:t>
+      </w:r>
+      <w:r>
+        <w:tab/>
+      </w:r>
+      <w:r>
+        <w:br/>
+      </w:r>
+      <w:r>
+        <w:br/>
+        <w:t xml:space="preserve">This field should not be </w:t>
+      </w:r>
+      <w:r>
+        <w:t>edited</w:t>
+      </w:r>
+      <w:r>
+        <w:t>.</w:t>
+      </w:r>
+    </w:p>
+    <w:p>
+      <w:pPr>
+        <w:pStyle w:val="Heading3"/>
+      </w:pPr>
+      <w:r>
+        <w:t>Notes</w:t>
+      </w:r>
+    </w:p>
+    <w:p>
+      <w:pPr>
+        <w:pStyle w:val="BodyText"/>
+      </w:pPr>
+      <w:r>
+        <w:t>This is a general notes field.</w:t>
+      </w:r>
+    </w:p>
+    <w:p>
+      <w:pPr>
+        <w:spacing w:after="0"/>
+        <w:jc w:val="left"/>
+        <w:rPr>
+          <w:sz w:val="32"/>
+          <w:szCs w:val="32"/>
+        </w:rPr>
+      </w:pPr>
+      <w:r>
+        <w:br w:type="page"/>
+      </w:r>
+    </w:p>
+    <w:p>
+      <w:pPr>
+        <w:pStyle w:val="Heading2"/>
+        <w:rPr>
+          <w:sz w:val="22"/>
+          <w:szCs w:val="22"/>
+        </w:rPr>
+      </w:pPr>
+      <w:bookmarkStart w:id="19" w:name="_800-30_Quantization"/>
+      <w:bookmarkEnd w:id="19"/>
+      <w:r>
+        <w:lastRenderedPageBreak/>
+        <w:t>800-30</w:t>
+      </w:r>
+      <w:r>
+        <w:t xml:space="preserve"> Quantization</w:t>
+      </w:r>
+    </w:p>
+    <w:p>
+      <w:r>
+        <w:t>This sheet provides translation between the rubric value and its quantized representation.</w:t>
+      </w:r>
+    </w:p>
+    <w:p>
+      <w:pPr>
+        <w:pStyle w:val="Note"/>
+        <w:rPr>
+          <w:color w:val="0070C0"/>
+        </w:rPr>
+      </w:pPr>
+      <w:r>
+        <w:rPr>
+          <w:b/>
+          <w:bCs/>
+          <w:color w:val="0070C0"/>
+        </w:rPr>
+        <w:t>Note:</w:t>
+      </w:r>
+      <w:r>
+        <w:rPr>
+          <w:b/>
+          <w:bCs/>
+          <w:color w:val="0070C0"/>
+        </w:rPr>
+        <w:tab/>
+      </w:r>
+      <w:r>
+        <w:t>This sheet (based on NIST SP 800-30) is complete and should not be modified</w:t>
+      </w:r>
+      <w:r>
+        <w:t>.</w:t>
+      </w:r>
+    </w:p>
+    <w:p>
+      <w:r>
+        <w:t xml:space="preserve">The </w:t>
+      </w:r>
+      <w:r>
+        <w:rPr>
+          <w:b/>
+          <w:bCs/>
+        </w:rPr>
+        <w:t>800-30</w:t>
+      </w:r>
+      <w:r>
+        <w:rPr>
+          <w:b/>
+          <w:bCs/>
+        </w:rPr>
+        <w:t xml:space="preserve"> quantization</w:t>
+      </w:r>
+      <w:r>
+        <w:t xml:space="preserve"> sheet of the workbook is shown below:</w:t>
+      </w:r>
+    </w:p>
+    <w:p>
+      <w:pPr>
+        <w:jc w:val="center"/>
+      </w:pPr>
+      <w:r>
+        <w:rPr>
+          <w:noProof/>
+        </w:rPr>
+        <w:drawing>
+          <wp:inline distT="0" distB="0" distL="0" distR="0" wp14:anchorId="4C5C6B8C" wp14:editId="4EB4DD84">
+            <wp:extent cx="5441070" cy="1837854"/>
+            <wp:effectExtent l="0" t="0" r="0" b="3810"/>
+            <wp:docPr id="1516524634" name="Picture 1"/>
+            <wp:cNvGraphicFramePr>
+              <a:graphicFrameLocks xmlns:a="http://schemas.openxmlformats.org/drawingml/2006/main" noChangeAspect="1"/>
+            </wp:cNvGraphicFramePr>
+            <a:graphic xmlns:a="http://schemas.openxmlformats.org/drawingml/2006/main">
+              <a:graphicData uri="http://schemas.openxmlformats.org/drawingml/2006/picture">
+                <pic:pic xmlns:pic="http://schemas.openxmlformats.org/drawingml/2006/picture">
+                  <pic:nvPicPr>
+                    <pic:cNvPr id="1516524634" name="Picture 1"/>
+                    <pic:cNvPicPr/>
+                  </pic:nvPicPr>
+                  <pic:blipFill>
+                    <a:blip r:embed="rId20"/>
+                    <a:stretch>
+                      <a:fillRect/>
+                    </a:stretch>
+                  </pic:blipFill>
+                  <pic:spPr>
+                    <a:xfrm>
+                      <a:off x="0" y="0"/>
+                      <a:ext cx="5468387" cy="1847081"/>
+                    </a:xfrm>
+                    <a:prstGeom prst="rect">
+                      <a:avLst/>
+                    </a:prstGeom>
+                  </pic:spPr>
+                </pic:pic>
+              </a:graphicData>
+            </a:graphic>
+          </wp:inline>
+        </w:drawing>
+      </w:r>
+    </w:p>
+    <w:p>
+      <w:pPr>
+        <w:pStyle w:val="Note"/>
+        <w:rPr>
+          <w:color w:val="0070C0"/>
+        </w:rPr>
+      </w:pPr>
+      <w:r>
+        <w:rPr>
+          <w:b/>
+          <w:bCs/>
+          <w:color w:val="0070C0"/>
+        </w:rPr>
+        <w:t>Note:</w:t>
+      </w:r>
+      <w:r>
+        <w:rPr>
+          <w:b/>
+          <w:bCs/>
+          <w:color w:val="0070C0"/>
+        </w:rPr>
+        <w:tab/>
+      </w:r>
+      <w:r>
+        <w:t>A true zero (none) entry is pre-populated in order to support automation.</w:t>
+      </w:r>
+    </w:p>
+    <w:p>
+      <w:pPr>
+        <w:pStyle w:val="Heading3"/>
+      </w:pPr>
+      <w:r>
+        <w:t>Min Value</w:t>
+      </w:r>
+    </w:p>
+    <w:p>
+      <w:r>
+        <w:t xml:space="preserve">This is the </w:t>
+      </w:r>
+      <w:r>
+        <w:t>minimum value of the quantization band</w:t>
+      </w:r>
+      <w:r>
+        <w:t>.</w:t>
+      </w:r>
+    </w:p>
+    <w:p>
+      <w:pPr>
+        <w:ind w:left="720" w:hanging="720"/>
+      </w:pPr>
+      <w:r>
+        <w:rPr>
+          <w:b/>
+          <w:bCs/>
+          <w:color w:val="0070C0"/>
+        </w:rPr>
+        <w:t>Note:</w:t>
+      </w:r>
+      <w:r>
+        <w:tab/>
+      </w:r>
+      <w:r>
+        <w:t xml:space="preserve">The second entry pre-populates this value to be slightly greater than the </w:t>
+      </w:r>
+      <w:r>
+        <w:rPr>
+          <w:b/>
+          <w:bCs/>
+        </w:rPr>
+        <w:t>‘none’</w:t>
+      </w:r>
+      <w:r>
+        <w:t xml:space="preserve"> band</w:t>
+      </w:r>
+      <w:r>
+        <w:t>.</w:t>
+      </w:r>
+    </w:p>
+    <w:p>
+      <w:pPr>
+        <w:ind w:left="720" w:hanging="720"/>
+      </w:pPr>
+      <w:r>
+        <w:rPr>
+          <w:b/>
+          <w:bCs/>
+          <w:color w:val="0070C0"/>
+        </w:rPr>
+        <w:t>Note:</w:t>
+      </w:r>
+      <w:r>
+        <w:tab/>
+      </w:r>
+      <w:r>
+        <w:t xml:space="preserve">The values of this field are assigned in order to generate </w:t>
+      </w:r>
+      <w:r>
+        <w:t>the qualitative</w:t>
+      </w:r>
+      <w:r>
+        <w:t xml:space="preserve"> values specified in NIST SP 800-30 </w:t>
+      </w:r>
+      <w:r>
+        <w:t>appendix</w:t>
+      </w:r>
+      <w:r>
+        <w:t xml:space="preserve"> G</w:t>
+      </w:r>
+      <w:r>
+        <w:t>.</w:t>
+      </w:r>
+    </w:p>
+    <w:p>
+      <w:pPr>
+        <w:pStyle w:val="Heading3"/>
+      </w:pPr>
+      <w:r>
+        <w:t>Label</w:t>
+      </w:r>
+    </w:p>
+    <w:p>
+      <w:r>
+        <w:t xml:space="preserve">This is the </w:t>
+      </w:r>
+      <w:r>
+        <w:t>name of the quantization band.</w:t>
+      </w:r>
+    </w:p>
+    <w:p>
+      <w:pPr>
+        <w:ind w:left="720" w:hanging="720"/>
+      </w:pPr>
+      <w:r>
+        <w:rPr>
+          <w:b/>
+          <w:bCs/>
+          <w:color w:val="0070C0"/>
+        </w:rPr>
+        <w:t>Note:</w:t>
+      </w:r>
+      <w:r>
+        <w:tab/>
+      </w:r>
+      <w:r>
+        <w:t>This column is used to populate field</w:t>
+      </w:r>
+      <w:r>
+        <w:t>s</w:t>
+      </w:r>
+      <w:r>
+        <w:t xml:space="preserve"> on the </w:t>
+      </w:r>
+      <w:r>
+        <w:rPr>
+          <w:b/>
+          <w:bCs/>
+        </w:rPr>
+        <w:t>ranking</w:t>
+      </w:r>
+      <w:r>
+        <w:t xml:space="preserve"> sheet corresponding</w:t>
+      </w:r>
+      <w:r>
+        <w:t>.</w:t>
+      </w:r>
+      <w:r>
+        <w:t xml:space="preserve"> It is used for both drop-down lists and computed fields.</w:t>
+      </w:r>
+    </w:p>
+    <w:p>
+      <w:pPr>
+        <w:pStyle w:val="Heading3"/>
+      </w:pPr>
+      <w:r>
+        <w:t>Compositing</w:t>
+      </w:r>
+      <w:r>
+        <w:t xml:space="preserve"> Value</w:t>
+      </w:r>
+    </w:p>
+    <w:p>
+      <w:r>
+        <w:t xml:space="preserve">This </w:t>
+      </w:r>
+      <w:r>
+        <w:t xml:space="preserve">value is used to create an overall likelihood based on </w:t>
+      </w:r>
+      <w:r>
+        <w:t xml:space="preserve">the </w:t>
+      </w:r>
+      <w:r>
+        <w:rPr>
+          <w:b/>
+          <w:bCs/>
+        </w:rPr>
+        <w:t>initiation / occurrence</w:t>
+      </w:r>
+      <w:r>
+        <w:t xml:space="preserve"> and </w:t>
+      </w:r>
+      <w:r>
+        <w:rPr>
+          <w:b/>
+          <w:bCs/>
+        </w:rPr>
+        <w:t>adverse impact</w:t>
+      </w:r>
+      <w:r>
+        <w:t xml:space="preserve"> fields</w:t>
+      </w:r>
+      <w:r>
+        <w:t>.</w:t>
+      </w:r>
+    </w:p>
+    <w:p>
+      <w:pPr>
+        <w:ind w:left="720" w:hanging="720"/>
+      </w:pPr>
+      <w:r>
+        <w:rPr>
+          <w:b/>
+          <w:bCs/>
+          <w:color w:val="0070C0"/>
+        </w:rPr>
+        <w:t>Note:</w:t>
+      </w:r>
+      <w:r>
+        <w:tab/>
+      </w:r>
+      <w:r>
+        <w:t xml:space="preserve">The </w:t>
+      </w:r>
+      <w:r>
+        <w:t>values of this field are assigned in order to generate composite values specified in NIST SP 800-30 table G-5</w:t>
+      </w:r>
+      <w:r>
+        <w:t>.</w:t>
+      </w:r>
+    </w:p>
+    <w:p>
+      <w:pPr>
+        <w:pStyle w:val="Heading3"/>
+      </w:pPr>
+      <w:r>
+        <w:lastRenderedPageBreak/>
+        <w:t>Description</w:t>
+      </w:r>
+    </w:p>
+    <w:p>
+      <w:r>
+        <w:t xml:space="preserve">This is the </w:t>
+      </w:r>
+      <w:r>
+        <w:t>description of the quantization band</w:t>
+      </w:r>
+      <w:r>
+        <w:t>.</w:t>
+      </w:r>
+    </w:p>
+    <w:p>
+      <w:pPr>
+        <w:pStyle w:val="Heading3"/>
+      </w:pPr>
+      <w:r>
+        <w:t>Notes</w:t>
+      </w:r>
+    </w:p>
+    <w:p>
+      <w:pPr>
+        <w:pStyle w:val="BodyText"/>
+      </w:pPr>
+      <w:r>
+        <w:t>This is a general notes field.</w:t>
       </w:r>
     </w:p>
     <w:p>
@@ -4291,7 +5696,7 @@
         </w:rPr>
         <w:br/>
       </w:r>
-      <w:hyperlink r:id="rId16" w:history="1">
+      <w:hyperlink r:id="rId21" w:history="1">
         <w:r>
           <w:rPr>
             <w:rStyle w:val="Hyperlink"/>
@@ -4329,7 +5734,7 @@
         </w:rPr>
         <w:br/>
       </w:r>
-      <w:hyperlink r:id="rId17" w:history="1">
+      <w:hyperlink r:id="rId22" w:history="1">
         <w:r>
           <w:rPr>
             <w:rStyle w:val="Hyperlink"/>
@@ -4378,7 +5783,7 @@
         </w:rPr>
         <w:br/>
       </w:r>
-      <w:hyperlink r:id="rId18" w:history="1">
+      <w:hyperlink r:id="rId23" w:history="1">
         <w:r>
           <w:rPr>
             <w:rStyle w:val="Hyperlink"/>
@@ -4431,7 +5836,7 @@
         </w:rPr>
         <w:br/>
       </w:r>
-      <w:hyperlink r:id="rId19" w:history="1">
+      <w:hyperlink r:id="rId24" w:history="1">
         <w:r>
           <w:rPr>
             <w:rStyle w:val="Hyperlink"/>
@@ -4491,7 +5896,7 @@
         </w:rPr>
         <w:br/>
       </w:r>
-      <w:hyperlink r:id="rId20" w:history="1">
+      <w:hyperlink r:id="rId25" w:history="1">
         <w:r>
           <w:rPr>
             <w:rStyle w:val="Hyperlink"/>
@@ -4508,6 +5913,69 @@
     </w:p>
     <w:p>
       <w:pPr>
+        <w:pStyle w:val="ListParagraph"/>
+        <w:numPr>
+          <w:ilvl w:val="0"/>
+          <w:numId w:val="3"/>
+        </w:numPr>
+      </w:pPr>
+      <w:r>
+        <w:rPr>
+          <w:b/>
+          <w:bCs/>
+        </w:rPr>
+        <w:t xml:space="preserve">AVCDL </w:t>
+      </w:r>
+      <w:r>
+        <w:rPr>
+          <w:b/>
+          <w:bCs/>
+        </w:rPr>
+        <w:t>threat candidate ranking</w:t>
+      </w:r>
+      <w:r>
+        <w:rPr>
+          <w:b/>
+          <w:bCs/>
+        </w:rPr>
+        <w:t xml:space="preserve"> </w:t>
+      </w:r>
+      <w:r>
+        <w:rPr>
+          <w:b/>
+          <w:bCs/>
+        </w:rPr>
+        <w:t>(SP 800-30)</w:t>
+      </w:r>
+      <w:r>
+        <w:rPr>
+          <w:b/>
+          <w:bCs/>
+        </w:rPr>
+        <w:t xml:space="preserve"> </w:t>
+      </w:r>
+      <w:r>
+        <w:rPr>
+          <w:b/>
+          <w:bCs/>
+        </w:rPr>
+        <w:t xml:space="preserve">template </w:t>
+      </w:r>
+      <w:r>
+        <w:t>(AVCDL template)</w:t>
+      </w:r>
+    </w:p>
+    <w:p>
+      <w:pPr>
+        <w:ind w:left="360"/>
+        <w:rPr>
+          <w:b/>
+          <w:bCs/>
+        </w:rPr>
+      </w:pPr>
+    </w:p>
+    <w:p>
+      <w:pPr>
         <w:ind w:left="360"/>
         <w:rPr>
           <w:b/>
@@ -4517,9 +5985,9 @@
     </w:p>
     <w:p/>
     <w:sectPr>
-      <w:footerReference w:type="even" r:id="rId21"/>
-      <w:footerReference w:type="default" r:id="rId22"/>
-      <w:headerReference w:type="first" r:id="rId23"/>
+      <w:footerReference w:type="even" r:id="rId26"/>
+      <w:footerReference w:type="default" r:id="rId27"/>
+      <w:headerReference w:type="first" r:id="rId28"/>
       <w:pgSz w:w="12226" w:h="15840"/>
       <w:pgMar w:top="1440" w:right="1440" w:bottom="1440" w:left="1440" w:header="720" w:footer="0" w:gutter="0"/>
       <w:pgNumType w:start="1"/>
@@ -7148,6 +8616,7 @@
   <w:style w:type="character" w:default="1" w:styleId="DefaultParagraphFont">
     <w:name w:val="Default Paragraph Font"/>
     <w:uiPriority w:val="1"/>
+    <w:semiHidden/>
     <w:unhideWhenUsed/>
   </w:style>
   <w:style w:type="table" w:default="1" w:styleId="TableNormal">

</xml_diff>

<commit_message>
updated Threat Prioritization - Candidate Ranking materials (spelling error in ranking template)
</commit_message>
<xml_diff>
--- a/source/reference_documents/tertiary_documents/foundation/threat prioritization/candidate ranking/Threat Prioritization - Candidate Ranking.docx
+++ b/source/reference_documents/tertiary_documents/foundation/threat prioritization/candidate ranking/Threat Prioritization - Candidate Ranking.docx
@@ -40,7 +40,7 @@
         <w:t xml:space="preserve">Version </w:t>
       </w:r>
       <w:r>
-        <w:t>2</w:t>
+        <w:t>3</w:t>
       </w:r>
     </w:p>
     <w:p>
@@ -57,7 +57,7 @@
         <w:rPr>
           <w:noProof/>
         </w:rPr>
-        <w:t>7/30/26 10:55 AM</w:t>
+        <w:t>8/11/26 7:56 AM</w:t>
       </w:r>
       <w:r>
         <w:fldChar w:fldCharType="end"/>
@@ -1922,10 +1922,7 @@
       </w:pPr>
       <w:r>
         <w:lastRenderedPageBreak/>
-        <w:t xml:space="preserve">Likelihood </w:t>
-      </w:r>
-      <w:r>
-        <w:t>(SP 800-30 Rubric)</w:t>
+        <w:t>Likelihood (SP 800-30 Rubric)</w:t>
       </w:r>
     </w:p>
     <w:p>
@@ -3134,14 +3131,17 @@
       </w:r>
     </w:p>
     <w:p>
+      <w:pPr>
+        <w:jc w:val="center"/>
+      </w:pPr>
       <w:r>
         <w:rPr>
           <w:noProof/>
         </w:rPr>
         <w:drawing>
-          <wp:inline distT="0" distB="0" distL="0" distR="0" wp14:anchorId="0CCCE2E8" wp14:editId="6793B2A0">
-            <wp:extent cx="6054665" cy="1547128"/>
-            <wp:effectExtent l="0" t="0" r="3810" b="2540"/>
+          <wp:inline distT="0" distB="0" distL="0" distR="0" wp14:anchorId="0CCCE2E8" wp14:editId="09E138CD">
+            <wp:extent cx="5864878" cy="1547128"/>
+            <wp:effectExtent l="0" t="0" r="2540" b="2540"/>
             <wp:docPr id="1577273786" name="Picture 1"/>
             <wp:cNvGraphicFramePr>
               <a:graphicFrameLocks xmlns:a="http://schemas.openxmlformats.org/drawingml/2006/main" noChangeAspect="1"/>
@@ -3162,7 +3162,7 @@
                   <pic:spPr>
                     <a:xfrm>
                       <a:off x="0" y="0"/>
-                      <a:ext cx="6054665" cy="1547128"/>
+                      <a:ext cx="5864878" cy="1547128"/>
                     </a:xfrm>
                     <a:prstGeom prst="rect">
                       <a:avLst/>
@@ -4245,13 +4245,7 @@
       </w:r>
       <w:r>
         <w:br/>
-        <w:t>(</w:t>
-      </w:r>
-      <w:r>
-        <w:t>NIST SP 800-30 Rubric</w:t>
-      </w:r>
-      <w:r>
-        <w:t>)</w:t>
+        <w:t>(NIST SP 800-30 Rubric)</w:t>
       </w:r>
     </w:p>
     <w:p>
@@ -4279,14 +4273,7 @@
           <w:b/>
           <w:bCs/>
         </w:rPr>
-        <w:t xml:space="preserve">threat candidate ranking </w:t>
-      </w:r>
-      <w:r>
-        <w:rPr>
-          <w:b/>
-          <w:bCs/>
-        </w:rPr>
-        <w:t>(SP 800-30)</w:t>
+        <w:t>threat candidate ranking (SP 800-30)</w:t>
       </w:r>
       <w:r>
         <w:rPr>
@@ -4427,13 +4414,7 @@
           <w:rPr>
             <w:rStyle w:val="Hyperlink"/>
           </w:rPr>
-          <w:t>800-30</w:t>
-        </w:r>
-        <w:r>
-          <w:rPr>
-            <w:rStyle w:val="Hyperlink"/>
-          </w:rPr>
-          <w:t xml:space="preserve"> quantization</w:t>
+          <w:t>800-30 quantization</w:t>
         </w:r>
       </w:hyperlink>
     </w:p>
@@ -4873,10 +4854,7 @@
     </w:p>
     <w:p>
       <w:r>
-        <w:t xml:space="preserve">This is the quantization of the likelihood </w:t>
-      </w:r>
-      <w:r>
-        <w:t>that the threat candidate has an adverse impact should it be realized</w:t>
+        <w:t>This is the quantization of the likelihood that the threat candidate has an adverse impact should it be realized</w:t>
       </w:r>
       <w:r>
         <w:t>.</w:t>
@@ -4973,10 +4951,7 @@
         <w:t>adverse impact</w:t>
       </w:r>
       <w:r>
-        <w:t xml:space="preserve"> </w:t>
-      </w:r>
-      <w:r>
-        <w:t>values</w:t>
+        <w:t xml:space="preserve"> values</w:t>
       </w:r>
       <w:r>
         <w:t>.</w:t>
@@ -5119,10 +5094,7 @@
         <w:tab/>
       </w:r>
       <w:r>
-        <w:t>This sheet (based on NIST SP 800-30) is complete and should not be modified</w:t>
-      </w:r>
-      <w:r>
-        <w:t>.</w:t>
+        <w:t>This sheet (based on NIST SP 800-30) is complete and should not be modified.</w:t>
       </w:r>
     </w:p>
     <w:p>
@@ -5366,10 +5338,7 @@
         <w:pStyle w:val="Heading3"/>
       </w:pPr>
       <w:r>
-        <w:t>Compositing</w:t>
-      </w:r>
-      <w:r>
-        <w:t xml:space="preserve"> Value</w:t>
+        <w:t>Compositing Value</w:t>
       </w:r>
     </w:p>
     <w:p>
@@ -5377,10 +5346,7 @@
         <w:t xml:space="preserve">This </w:t>
       </w:r>
       <w:r>
-        <w:t xml:space="preserve">value is used to create an overall likelihood based on </w:t>
-      </w:r>
-      <w:r>
-        <w:t xml:space="preserve">the </w:t>
+        <w:t xml:space="preserve">value is used to create an overall likelihood based on the </w:t>
       </w:r>
       <w:r>
         <w:rPr>
@@ -5422,10 +5388,7 @@
         <w:tab/>
       </w:r>
       <w:r>
-        <w:t xml:space="preserve">The </w:t>
-      </w:r>
-      <w:r>
-        <w:t>values of this field are assigned in order to generate composite values specified in NIST SP 800-30 table G-5</w:t>
+        <w:t>The values of this field are assigned in order to generate composite values specified in NIST SP 800-30 table G-5</w:t>
       </w:r>
       <w:r>
         <w:t>.</w:t>

</xml_diff>